<commit_message>
dealing with docx improper save
</commit_message>
<xml_diff>
--- a/report/report.docx
+++ b/report/report.docx
@@ -6660,7 +6660,7 @@
         <w:t xml:space="preserve"> </w:t>
       </w:r>
       <w:r>
-        <w:t xml:space="preserve">from 0.833 to 0.792 (−4.1 points), which is real but far from fatal. The model</w:t>
+        <w:t xml:space="preserve">from 0.833 to 0.792 (−4.1 points). The model</w:t>
       </w:r>
       <w:r>
         <w:t xml:space="preserve"> </w:t>
@@ -6810,62 +6810,7 @@
         <w:t xml:space="preserve"> </w:t>
       </w:r>
       <w:r>
-        <w:t xml:space="preserve">inflated every RQ2 number. Grouping by prompt hash and</w:t>
-      </w:r>
-      <w:r>
-        <w:t xml:space="preserve"> </w:t>
-      </w:r>
-      <w:r>
-        <w:rPr>
-          <w:iCs/>
-          <w:i/>
-        </w:rPr>
-        <w:t xml:space="preserve">verifying</w:t>
-      </w:r>
-      <w:r>
-        <w:t xml:space="preserve"> </w:t>
-      </w:r>
-      <w:r>
-        <w:t xml:space="preserve">the</w:t>
-      </w:r>
-      <w:r>
-        <w:t xml:space="preserve"> </w:t>
-      </w:r>
-      <w:r>
-        <w:t xml:space="preserve">disjointness changed the setup from</w:t>
-      </w:r>
-      <w:r>
-        <w:t xml:space="preserve"> </w:t>
-      </w:r>
-      <w:r>
-        <w:t xml:space="preserve">“</w:t>
-      </w:r>
-      <w:r>
-        <w:t xml:space="preserve">probably fine</w:t>
-      </w:r>
-      <w:r>
-        <w:t xml:space="preserve">”</w:t>
-      </w:r>
-      <w:r>
-        <w:t xml:space="preserve"> </w:t>
-      </w:r>
-      <w:r>
-        <w:t xml:space="preserve">to</w:t>
-      </w:r>
-      <w:r>
-        <w:t xml:space="preserve"> </w:t>
-      </w:r>
-      <w:r>
-        <w:t xml:space="preserve">“</w:t>
-      </w:r>
-      <w:r>
-        <w:t xml:space="preserve">provably clean</w:t>
-      </w:r>
-      <w:r>
-        <w:t xml:space="preserve">”</w:t>
-      </w:r>
-      <w:r>
-        <w:t xml:space="preserve">.</w:t>
+        <w:t xml:space="preserve">inflated every RQ2 number.</w:t>
       </w:r>
     </w:p>
     <w:p>

</xml_diff>